<commit_message>
feat: exercices speciaux Canvas + routines dashboard + corrections pre-prod
- Ajout exercices speciaux (Fractal, Points Lumineux, Nuage de Points) avec moteur Canvas
- Nouvelle page special-training.html avec gate Premium/Pro
- Onglet Routines dans le dashboard sidebar avec CRUD complet
- Suppression bouton Gerer de config.html
- Corrections securite: CSP Helmet, CORS restreint, rate limiting global
- CRON expiration abonnements + migration unifiee
- Fix bug theme qui renvoyait au dashboard
- Redesign interface Rappels Personnels (cards visuelles, slider)
</commit_message>
<xml_diff>
--- a/Amelioration 1.docx
+++ b/Amelioration 1.docx
@@ -7,54 +7,6 @@
         <w:shd w:val="clear" w:color="auto" w:fill="002060"/>
         <w:jc w:val="center"/>
         <w:rPr>
-          <w:sz w:val="28"/>
-          <w:lang w:val="fr-FR"/>
-        </w:rPr>
-      </w:pPr>
-      <w:r>
-        <w:rPr>
-          <w:sz w:val="28"/>
-          <w:lang w:val="fr-FR"/>
-        </w:rPr>
-        <w:t>AMELIORATION</w:t>
-      </w:r>
-    </w:p>
-    <w:p>
-      <w:pPr>
-        <w:jc w:val="both"/>
-        <w:rPr>
-          <w:sz w:val="28"/>
-          <w:lang w:val="fr-FR"/>
-        </w:rPr>
-      </w:pPr>
-      <w:r>
-        <w:rPr>
-          <w:sz w:val="28"/>
-          <w:lang w:val="fr-FR"/>
-        </w:rPr>
-        <w:t>L'analyse de votre code montre une base technique très solide pour une application de santé oculaire (PWA, Wake Lock, calculs mathématiques pour les trajectoires, responsive design). L'application est déjà très fonctionnelle et bien conçue.</w:t>
-      </w:r>
-    </w:p>
-    <w:p>
-      <w:pPr>
-        <w:jc w:val="both"/>
-        <w:rPr>
-          <w:sz w:val="28"/>
-          <w:lang w:val="fr-FR"/>
-        </w:rPr>
-      </w:pPr>
-      <w:r>
-        <w:rPr>
-          <w:sz w:val="28"/>
-          <w:lang w:val="fr-FR"/>
-        </w:rPr>
-        <w:t xml:space="preserve">  Pour lui donner encore plus de valeur et transformer cet outil en une véritable solution de bien-être quotidien, voici plusieurs axes d'amélioration :</w:t>
-      </w:r>
-    </w:p>
-    <w:p>
-      <w:pPr>
-        <w:jc w:val="both"/>
-        <w:rPr>
           <w:b/>
           <w:sz w:val="28"/>
           <w:lang w:val="fr-FR"/>
@@ -66,942 +18,6 @@
           <w:sz w:val="28"/>
           <w:lang w:val="fr-FR"/>
         </w:rPr>
-        <w:t>1. Suivi et Motivation (</w:t>
-      </w:r>
-      <w:proofErr w:type="spellStart"/>
-      <w:r>
-        <w:rPr>
-          <w:b/>
-          <w:sz w:val="28"/>
-          <w:lang w:val="fr-FR"/>
-        </w:rPr>
-        <w:t>Gamification</w:t>
-      </w:r>
-      <w:proofErr w:type="spellEnd"/>
-      <w:r>
-        <w:rPr>
-          <w:b/>
-          <w:sz w:val="28"/>
-          <w:lang w:val="fr-FR"/>
-        </w:rPr>
-        <w:t xml:space="preserve"> &amp; </w:t>
-      </w:r>
-      <w:proofErr w:type="spellStart"/>
-      <w:r>
-        <w:rPr>
-          <w:b/>
-          <w:sz w:val="28"/>
-          <w:lang w:val="fr-FR"/>
-        </w:rPr>
-        <w:t>Stats</w:t>
-      </w:r>
-      <w:proofErr w:type="spellEnd"/>
-      <w:r>
-        <w:rPr>
-          <w:b/>
-          <w:sz w:val="28"/>
-          <w:lang w:val="fr-FR"/>
-        </w:rPr>
-        <w:t>)</w:t>
-      </w:r>
-    </w:p>
-    <w:p>
-      <w:pPr>
-        <w:jc w:val="both"/>
-        <w:rPr>
-          <w:sz w:val="28"/>
-          <w:lang w:val="fr-FR"/>
-        </w:rPr>
-      </w:pPr>
-      <w:r>
-        <w:rPr>
-          <w:b/>
-          <w:i/>
-          <w:sz w:val="28"/>
-          <w:lang w:val="fr-FR"/>
-        </w:rPr>
-        <w:t xml:space="preserve">   * Historique et Statistiques</w:t>
-      </w:r>
-      <w:r>
-        <w:rPr>
-          <w:sz w:val="28"/>
-          <w:lang w:val="fr-FR"/>
-        </w:rPr>
-        <w:t xml:space="preserve"> : Enregistrez les sessions terminées dans le </w:t>
-      </w:r>
-      <w:proofErr w:type="spellStart"/>
-      <w:r>
-        <w:rPr>
-          <w:sz w:val="28"/>
-          <w:lang w:val="fr-FR"/>
-        </w:rPr>
-        <w:t>localStorage</w:t>
-      </w:r>
-      <w:proofErr w:type="spellEnd"/>
-      <w:r>
-        <w:rPr>
-          <w:sz w:val="28"/>
-          <w:lang w:val="fr-FR"/>
-        </w:rPr>
-        <w:t xml:space="preserve"> pour afficher un calendrier d'activité ou une "série" (</w:t>
-      </w:r>
-      <w:proofErr w:type="spellStart"/>
-      <w:r>
-        <w:rPr>
-          <w:sz w:val="28"/>
-          <w:lang w:val="fr-FR"/>
-        </w:rPr>
-        <w:t>streak</w:t>
-      </w:r>
-      <w:proofErr w:type="spellEnd"/>
-      <w:r>
-        <w:rPr>
-          <w:sz w:val="28"/>
-          <w:lang w:val="fr-FR"/>
-        </w:rPr>
-        <w:t>) de jours consécutifs. Cela encourage la régularité.</w:t>
-      </w:r>
-    </w:p>
-    <w:p>
-      <w:pPr>
-        <w:jc w:val="both"/>
-        <w:rPr>
-          <w:sz w:val="28"/>
-          <w:lang w:val="fr-FR"/>
-        </w:rPr>
-      </w:pPr>
-      <w:r>
-        <w:rPr>
-          <w:sz w:val="28"/>
-          <w:lang w:val="fr-FR"/>
-        </w:rPr>
-        <w:t xml:space="preserve">   </w:t>
-      </w:r>
-      <w:r>
-        <w:rPr>
-          <w:b/>
-          <w:i/>
-          <w:sz w:val="28"/>
-          <w:lang w:val="fr-FR"/>
-        </w:rPr>
-        <w:t>* Objectifs Quotidiens</w:t>
-      </w:r>
-      <w:r>
-        <w:rPr>
-          <w:sz w:val="28"/>
-          <w:lang w:val="fr-FR"/>
-        </w:rPr>
-        <w:t xml:space="preserve"> : Permettez à l'utilisateur de se fixer un objectif (</w:t>
-      </w:r>
-      <w:proofErr w:type="gramStart"/>
-      <w:r>
-        <w:rPr>
-          <w:sz w:val="28"/>
-          <w:lang w:val="fr-FR"/>
-        </w:rPr>
-        <w:t>ex:</w:t>
-      </w:r>
-      <w:proofErr w:type="gramEnd"/>
-      <w:r>
-        <w:rPr>
-          <w:sz w:val="28"/>
-          <w:lang w:val="fr-FR"/>
-        </w:rPr>
-        <w:t xml:space="preserve"> 5 minutes par jour) avec une barre de progression globale.</w:t>
-      </w:r>
-    </w:p>
-    <w:p>
-      <w:pPr>
-        <w:jc w:val="both"/>
-        <w:rPr>
-          <w:sz w:val="28"/>
-          <w:lang w:val="fr-FR"/>
-        </w:rPr>
-      </w:pPr>
-      <w:r>
-        <w:rPr>
-          <w:sz w:val="28"/>
-          <w:lang w:val="fr-FR"/>
-        </w:rPr>
-        <w:t xml:space="preserve">   </w:t>
-      </w:r>
-      <w:r>
-        <w:rPr>
-          <w:b/>
-          <w:i/>
-          <w:sz w:val="28"/>
-          <w:lang w:val="fr-FR"/>
-        </w:rPr>
-        <w:t>* Badges de Progression</w:t>
-      </w:r>
-      <w:r>
-        <w:rPr>
-          <w:sz w:val="28"/>
-          <w:lang w:val="fr-FR"/>
-        </w:rPr>
-        <w:t xml:space="preserve"> : Débloquez des succès (</w:t>
-      </w:r>
-      <w:proofErr w:type="gramStart"/>
-      <w:r>
-        <w:rPr>
-          <w:sz w:val="28"/>
-          <w:lang w:val="fr-FR"/>
-        </w:rPr>
-        <w:t>ex:</w:t>
-      </w:r>
-      <w:proofErr w:type="gramEnd"/>
-      <w:r>
-        <w:rPr>
-          <w:sz w:val="28"/>
-          <w:lang w:val="fr-FR"/>
-        </w:rPr>
-        <w:t xml:space="preserve"> "Première semaine complétée", "Maître de l'accommodation").</w:t>
-      </w:r>
-    </w:p>
-    <w:p>
-      <w:pPr>
-        <w:jc w:val="both"/>
-        <w:rPr>
-          <w:b/>
-          <w:sz w:val="28"/>
-          <w:lang w:val="fr-FR"/>
-        </w:rPr>
-      </w:pPr>
-      <w:r>
-        <w:rPr>
-          <w:b/>
-          <w:sz w:val="28"/>
-          <w:lang w:val="fr-FR"/>
-        </w:rPr>
-        <w:t>2. Programmes et Routines Guidées</w:t>
-      </w:r>
-    </w:p>
-    <w:p>
-      <w:pPr>
-        <w:jc w:val="both"/>
-        <w:rPr>
-          <w:sz w:val="28"/>
-          <w:lang w:val="fr-FR"/>
-        </w:rPr>
-      </w:pPr>
-      <w:r>
-        <w:rPr>
-          <w:sz w:val="28"/>
-          <w:lang w:val="fr-FR"/>
-        </w:rPr>
-        <w:t xml:space="preserve">   </w:t>
-      </w:r>
-      <w:r>
-        <w:rPr>
-          <w:b/>
-          <w:i/>
-          <w:sz w:val="28"/>
-          <w:lang w:val="fr-FR"/>
-        </w:rPr>
-        <w:t>* Routines Thématiques</w:t>
-      </w:r>
-      <w:r>
-        <w:rPr>
-          <w:sz w:val="28"/>
-          <w:lang w:val="fr-FR"/>
-        </w:rPr>
-        <w:t xml:space="preserve"> : Au lieu de laisser l'utilisateur choisir ses exercices, proposez des "Playlists" </w:t>
-      </w:r>
-      <w:proofErr w:type="spellStart"/>
-      <w:r>
-        <w:rPr>
-          <w:sz w:val="28"/>
-          <w:lang w:val="fr-FR"/>
-        </w:rPr>
-        <w:t>pré-configurées</w:t>
-      </w:r>
-      <w:proofErr w:type="spellEnd"/>
-      <w:r>
-        <w:rPr>
-          <w:sz w:val="28"/>
-          <w:lang w:val="fr-FR"/>
-        </w:rPr>
-        <w:t xml:space="preserve"> :</w:t>
-      </w:r>
-    </w:p>
-    <w:p>
-      <w:pPr>
-        <w:jc w:val="both"/>
-        <w:rPr>
-          <w:sz w:val="28"/>
-          <w:lang w:val="fr-FR"/>
-        </w:rPr>
-      </w:pPr>
-      <w:r>
-        <w:rPr>
-          <w:b/>
-          <w:i/>
-          <w:sz w:val="28"/>
-          <w:lang w:val="fr-FR"/>
-        </w:rPr>
-        <w:t xml:space="preserve">   * Soulagement Fatigue Numérique</w:t>
-      </w:r>
-      <w:r>
-        <w:rPr>
-          <w:sz w:val="28"/>
-          <w:lang w:val="fr-FR"/>
-        </w:rPr>
-        <w:t xml:space="preserve"> : Focus sur la </w:t>
-      </w:r>
-      <w:r>
-        <w:rPr>
-          <w:b/>
-          <w:sz w:val="28"/>
-          <w:lang w:val="fr-FR"/>
-        </w:rPr>
-        <w:t>règle 20-20-20</w:t>
-      </w:r>
-      <w:r>
-        <w:rPr>
-          <w:sz w:val="28"/>
-          <w:lang w:val="fr-FR"/>
-        </w:rPr>
-        <w:t xml:space="preserve"> et le </w:t>
-      </w:r>
-      <w:proofErr w:type="spellStart"/>
-      <w:r>
-        <w:rPr>
-          <w:b/>
-          <w:sz w:val="28"/>
-          <w:lang w:val="fr-FR"/>
-        </w:rPr>
-        <w:t>palming</w:t>
-      </w:r>
-      <w:proofErr w:type="spellEnd"/>
-      <w:r>
-        <w:rPr>
-          <w:sz w:val="28"/>
-          <w:lang w:val="fr-FR"/>
-        </w:rPr>
-        <w:t>.</w:t>
-      </w:r>
-    </w:p>
-    <w:p>
-      <w:pPr>
-        <w:jc w:val="both"/>
-        <w:rPr>
-          <w:sz w:val="28"/>
-          <w:lang w:val="fr-FR"/>
-        </w:rPr>
-      </w:pPr>
-      <w:r>
-        <w:rPr>
-          <w:sz w:val="28"/>
-          <w:lang w:val="fr-FR"/>
-        </w:rPr>
-        <w:t xml:space="preserve">   * </w:t>
-      </w:r>
-      <w:r>
-        <w:rPr>
-          <w:b/>
-          <w:i/>
-          <w:sz w:val="28"/>
-          <w:lang w:val="fr-FR"/>
-        </w:rPr>
-        <w:t>Réveil Matinal</w:t>
-      </w:r>
-      <w:r>
-        <w:rPr>
-          <w:sz w:val="28"/>
-          <w:lang w:val="fr-FR"/>
-        </w:rPr>
-        <w:t xml:space="preserve"> : Exercices de poursuite douce et saccades pour stimuler les muscles.</w:t>
-      </w:r>
-    </w:p>
-    <w:p>
-      <w:pPr>
-        <w:jc w:val="both"/>
-        <w:rPr>
-          <w:sz w:val="28"/>
-          <w:lang w:val="fr-FR"/>
-        </w:rPr>
-      </w:pPr>
-      <w:r>
-        <w:rPr>
-          <w:b/>
-          <w:i/>
-          <w:sz w:val="28"/>
-          <w:lang w:val="fr-FR"/>
-        </w:rPr>
-        <w:t xml:space="preserve">   * Focus Intense</w:t>
-      </w:r>
-      <w:r>
-        <w:rPr>
-          <w:sz w:val="28"/>
-          <w:lang w:val="fr-FR"/>
-        </w:rPr>
-        <w:t xml:space="preserve"> : Exercices d'accommodation (zoom/profondeur).</w:t>
-      </w:r>
-    </w:p>
-    <w:p>
-      <w:pPr>
-        <w:jc w:val="both"/>
-        <w:rPr>
-          <w:sz w:val="28"/>
-          <w:lang w:val="fr-FR"/>
-        </w:rPr>
-      </w:pPr>
-      <w:r>
-        <w:rPr>
-          <w:sz w:val="28"/>
-          <w:lang w:val="fr-FR"/>
-        </w:rPr>
-        <w:t xml:space="preserve">   </w:t>
-      </w:r>
-      <w:r>
-        <w:rPr>
-          <w:b/>
-          <w:sz w:val="28"/>
-          <w:lang w:val="fr-FR"/>
-        </w:rPr>
-        <w:t>* Enchaînements Intelligents</w:t>
-      </w:r>
-      <w:r>
-        <w:rPr>
-          <w:sz w:val="28"/>
-          <w:lang w:val="fr-FR"/>
-        </w:rPr>
-        <w:t xml:space="preserve"> : Ajoutez une courte transition textuelle entre chaque exercice (</w:t>
-      </w:r>
-      <w:proofErr w:type="gramStart"/>
-      <w:r>
-        <w:rPr>
-          <w:sz w:val="28"/>
-          <w:lang w:val="fr-FR"/>
-        </w:rPr>
-        <w:t>ex:</w:t>
-      </w:r>
-      <w:proofErr w:type="gramEnd"/>
-      <w:r>
-        <w:rPr>
-          <w:sz w:val="28"/>
-          <w:lang w:val="fr-FR"/>
-        </w:rPr>
-        <w:t xml:space="preserve"> "Prochain exercice     : Saccades horizontales dans 3... 2... 1...") pour que l'utilisateur n'ait pas à regarder les menus.</w:t>
-      </w:r>
-    </w:p>
-    <w:p>
-      <w:pPr>
-        <w:jc w:val="both"/>
-        <w:rPr>
-          <w:b/>
-          <w:sz w:val="28"/>
-          <w:lang w:val="fr-FR"/>
-        </w:rPr>
-      </w:pPr>
-      <w:r>
-        <w:rPr>
-          <w:b/>
-          <w:sz w:val="28"/>
-          <w:lang w:val="fr-FR"/>
-        </w:rPr>
-        <w:t>3. Audio et Immersion</w:t>
-      </w:r>
-    </w:p>
-    <w:p>
-      <w:pPr>
-        <w:jc w:val="both"/>
-        <w:rPr>
-          <w:sz w:val="28"/>
-          <w:lang w:val="fr-FR"/>
-        </w:rPr>
-      </w:pPr>
-      <w:r>
-        <w:rPr>
-          <w:sz w:val="28"/>
-          <w:lang w:val="fr-FR"/>
-        </w:rPr>
-        <w:t xml:space="preserve">   </w:t>
-      </w:r>
-      <w:r>
-        <w:rPr>
-          <w:b/>
-          <w:i/>
-          <w:sz w:val="28"/>
-          <w:lang w:val="fr-FR"/>
-        </w:rPr>
-        <w:t>* Guidage Vocal</w:t>
-      </w:r>
-      <w:r>
-        <w:rPr>
-          <w:sz w:val="28"/>
-          <w:lang w:val="fr-FR"/>
-        </w:rPr>
-        <w:t xml:space="preserve"> : Utilisez l'API </w:t>
-      </w:r>
-      <w:proofErr w:type="spellStart"/>
-      <w:r>
-        <w:rPr>
-          <w:sz w:val="28"/>
-          <w:lang w:val="fr-FR"/>
-        </w:rPr>
-        <w:t>SpeechSynthesis</w:t>
-      </w:r>
-      <w:proofErr w:type="spellEnd"/>
-      <w:r>
-        <w:rPr>
-          <w:sz w:val="28"/>
-          <w:lang w:val="fr-FR"/>
-        </w:rPr>
-        <w:t xml:space="preserve"> pour annoncer le changement d'exercice ou donner des consignes (</w:t>
-      </w:r>
-      <w:proofErr w:type="gramStart"/>
-      <w:r>
-        <w:rPr>
-          <w:sz w:val="28"/>
-          <w:lang w:val="fr-FR"/>
-        </w:rPr>
-        <w:t>ex:</w:t>
-      </w:r>
-      <w:proofErr w:type="gramEnd"/>
-      <w:r>
-        <w:rPr>
-          <w:sz w:val="28"/>
-          <w:lang w:val="fr-FR"/>
-        </w:rPr>
-        <w:t xml:space="preserve"> "Maintenant, suivez le point sans bouger la tête").</w:t>
-      </w:r>
-    </w:p>
-    <w:p>
-      <w:pPr>
-        <w:jc w:val="both"/>
-        <w:rPr>
-          <w:sz w:val="28"/>
-          <w:lang w:val="fr-FR"/>
-        </w:rPr>
-      </w:pPr>
-      <w:r>
-        <w:rPr>
-          <w:sz w:val="28"/>
-          <w:lang w:val="fr-FR"/>
-        </w:rPr>
-        <w:lastRenderedPageBreak/>
-        <w:t xml:space="preserve">   </w:t>
-      </w:r>
-      <w:r>
-        <w:rPr>
-          <w:b/>
-          <w:i/>
-          <w:sz w:val="28"/>
-          <w:lang w:val="fr-FR"/>
-        </w:rPr>
-        <w:t>* Signaux Sonores</w:t>
-      </w:r>
-      <w:r>
-        <w:rPr>
-          <w:sz w:val="28"/>
-          <w:lang w:val="fr-FR"/>
-        </w:rPr>
-        <w:t xml:space="preserve"> : Ajoutez des bips discrets pour marquer le rythme des saccades ou la fin d'une session.</w:t>
-      </w:r>
-    </w:p>
-    <w:p>
-      <w:pPr>
-        <w:jc w:val="both"/>
-        <w:rPr>
-          <w:sz w:val="28"/>
-          <w:lang w:val="fr-FR"/>
-        </w:rPr>
-      </w:pPr>
-      <w:r>
-        <w:rPr>
-          <w:b/>
-          <w:i/>
-          <w:sz w:val="28"/>
-          <w:lang w:val="fr-FR"/>
-        </w:rPr>
-        <w:t xml:space="preserve">   * Ambiance Sonore</w:t>
-      </w:r>
-      <w:r>
-        <w:rPr>
-          <w:sz w:val="28"/>
-          <w:lang w:val="fr-FR"/>
-        </w:rPr>
-        <w:t xml:space="preserve"> : Intégrez des sons relaxants (bruit blanc, nature) activables pendant les phases de relaxation comme le "</w:t>
-      </w:r>
-      <w:proofErr w:type="spellStart"/>
-      <w:r>
-        <w:rPr>
-          <w:sz w:val="28"/>
-          <w:lang w:val="fr-FR"/>
-        </w:rPr>
-        <w:t>Palmage</w:t>
-      </w:r>
-      <w:proofErr w:type="spellEnd"/>
-      <w:r>
-        <w:rPr>
-          <w:sz w:val="28"/>
-          <w:lang w:val="fr-FR"/>
-        </w:rPr>
-        <w:t>".</w:t>
-      </w:r>
-    </w:p>
-    <w:p>
-      <w:pPr>
-        <w:jc w:val="both"/>
-        <w:rPr>
-          <w:b/>
-          <w:sz w:val="28"/>
-          <w:lang w:val="fr-FR"/>
-        </w:rPr>
-      </w:pPr>
-      <w:r>
-        <w:rPr>
-          <w:b/>
-          <w:sz w:val="28"/>
-          <w:lang w:val="fr-FR"/>
-        </w:rPr>
-        <w:t>4. Rappels et Prévention (Engagement)</w:t>
-      </w:r>
-    </w:p>
-    <w:p>
-      <w:pPr>
-        <w:jc w:val="both"/>
-        <w:rPr>
-          <w:sz w:val="28"/>
-          <w:lang w:val="fr-FR"/>
-        </w:rPr>
-      </w:pPr>
-      <w:r>
-        <w:rPr>
-          <w:sz w:val="28"/>
-          <w:lang w:val="fr-FR"/>
-        </w:rPr>
-        <w:t xml:space="preserve">   </w:t>
-      </w:r>
-      <w:r>
-        <w:rPr>
-          <w:b/>
-          <w:i/>
-          <w:sz w:val="28"/>
-          <w:lang w:val="fr-FR"/>
-        </w:rPr>
-        <w:t>* Rappels 20-20-20</w:t>
-      </w:r>
-      <w:r>
-        <w:rPr>
-          <w:sz w:val="28"/>
-          <w:lang w:val="fr-FR"/>
-        </w:rPr>
-        <w:t xml:space="preserve"> : Si l'application reste ouverte en arrière-plan, utilisez l'API de Notification pour rappeler à l'utilisateur de faire une pause toutes les 20 minutes.</w:t>
-      </w:r>
-    </w:p>
-    <w:p>
-      <w:pPr>
-        <w:jc w:val="both"/>
-        <w:rPr>
-          <w:sz w:val="28"/>
-          <w:lang w:val="fr-FR"/>
-        </w:rPr>
-      </w:pPr>
-      <w:r>
-        <w:rPr>
-          <w:b/>
-          <w:i/>
-          <w:sz w:val="28"/>
-          <w:lang w:val="fr-FR"/>
-        </w:rPr>
-        <w:t xml:space="preserve">   * Installation Mobile</w:t>
-      </w:r>
-      <w:r>
-        <w:rPr>
-          <w:sz w:val="28"/>
-          <w:lang w:val="fr-FR"/>
-        </w:rPr>
-        <w:t xml:space="preserve"> : Bien que vous ayez déjà une PWA, assurez-vous de bien mettre en avant la possibilité d'ajouter l'icône sur l'écran d'accueil pour un accès "en un clic" lors des pauses bureau.</w:t>
-      </w:r>
-    </w:p>
-    <w:p>
-      <w:pPr>
-        <w:jc w:val="both"/>
-        <w:rPr>
-          <w:b/>
-          <w:sz w:val="28"/>
-          <w:lang w:val="fr-FR"/>
-        </w:rPr>
-      </w:pPr>
-      <w:r>
-        <w:rPr>
-          <w:b/>
-          <w:sz w:val="28"/>
-          <w:lang w:val="fr-FR"/>
-        </w:rPr>
-        <w:t>5. Contenu Éducatif</w:t>
-      </w:r>
-    </w:p>
-    <w:p>
-      <w:pPr>
-        <w:jc w:val="both"/>
-        <w:rPr>
-          <w:sz w:val="28"/>
-          <w:lang w:val="fr-FR"/>
-        </w:rPr>
-      </w:pPr>
-      <w:r>
-        <w:rPr>
-          <w:sz w:val="28"/>
-          <w:lang w:val="fr-FR"/>
-        </w:rPr>
-        <w:t xml:space="preserve">   </w:t>
-      </w:r>
-      <w:r>
-        <w:rPr>
-          <w:b/>
-          <w:i/>
-          <w:sz w:val="28"/>
-          <w:lang w:val="fr-FR"/>
-        </w:rPr>
-        <w:t>* Le "Pourquoi"</w:t>
-      </w:r>
-      <w:r>
-        <w:rPr>
-          <w:sz w:val="28"/>
-          <w:lang w:val="fr-FR"/>
-        </w:rPr>
-        <w:t xml:space="preserve"> : Ajoutez une petite icône "Info" sur chaque exercice expliquant quel muscle est sollicité et quel est le bénéfice concret (</w:t>
-      </w:r>
-      <w:proofErr w:type="gramStart"/>
-      <w:r>
-        <w:rPr>
-          <w:sz w:val="28"/>
-          <w:lang w:val="fr-FR"/>
-        </w:rPr>
-        <w:t>ex:</w:t>
-      </w:r>
-      <w:proofErr w:type="gramEnd"/>
-      <w:r>
-        <w:rPr>
-          <w:sz w:val="28"/>
-          <w:lang w:val="fr-FR"/>
-        </w:rPr>
-        <w:t xml:space="preserve"> "Améliore la convergence", "Détend le muscle ciliaire").</w:t>
-      </w:r>
-    </w:p>
-    <w:p>
-      <w:pPr>
-        <w:jc w:val="both"/>
-        <w:rPr>
-          <w:sz w:val="28"/>
-          <w:lang w:val="fr-FR"/>
-        </w:rPr>
-      </w:pPr>
-      <w:r>
-        <w:rPr>
-          <w:sz w:val="28"/>
-          <w:lang w:val="fr-FR"/>
-        </w:rPr>
-        <w:t xml:space="preserve">   </w:t>
-      </w:r>
-      <w:r>
-        <w:rPr>
-          <w:b/>
-          <w:i/>
-          <w:sz w:val="28"/>
-          <w:lang w:val="fr-FR"/>
-        </w:rPr>
-        <w:t>* Conseils d'Ergonomie</w:t>
-      </w:r>
-      <w:r>
-        <w:rPr>
-          <w:sz w:val="28"/>
-          <w:lang w:val="fr-FR"/>
-        </w:rPr>
-        <w:t xml:space="preserve"> : Intégrez une section avec des conseils rapides sur la distance écran-œil, l'éclairage et la posture.</w:t>
-      </w:r>
-    </w:p>
-    <w:p>
-      <w:pPr>
-        <w:jc w:val="both"/>
-        <w:rPr>
-          <w:b/>
-          <w:sz w:val="28"/>
-          <w:lang w:val="fr-FR"/>
-        </w:rPr>
-      </w:pPr>
-      <w:r>
-        <w:rPr>
-          <w:b/>
-          <w:sz w:val="28"/>
-          <w:lang w:val="fr-FR"/>
-        </w:rPr>
-        <w:t>6. Améliorations de l'Interface (UI/UX)</w:t>
-      </w:r>
-    </w:p>
-    <w:p>
-      <w:pPr>
-        <w:jc w:val="both"/>
-        <w:rPr>
-          <w:sz w:val="28"/>
-          <w:lang w:val="fr-FR"/>
-        </w:rPr>
-      </w:pPr>
-      <w:r>
-        <w:rPr>
-          <w:b/>
-          <w:i/>
-          <w:sz w:val="28"/>
-          <w:lang w:val="fr-FR"/>
-        </w:rPr>
-        <w:t xml:space="preserve">   * Thèmes plus variés</w:t>
-      </w:r>
-      <w:r>
-        <w:rPr>
-          <w:sz w:val="28"/>
-          <w:lang w:val="fr-FR"/>
-        </w:rPr>
-        <w:t xml:space="preserve"> : Ajoutez des arrière-plans plus "zen" (dégradés animés doux, photos de paysages floues).</w:t>
-      </w:r>
-    </w:p>
-    <w:p>
-      <w:pPr>
-        <w:jc w:val="both"/>
-        <w:rPr>
-          <w:sz w:val="28"/>
-          <w:lang w:val="fr-FR"/>
-        </w:rPr>
-      </w:pPr>
-      <w:r>
-        <w:rPr>
-          <w:b/>
-          <w:i/>
-          <w:sz w:val="28"/>
-          <w:lang w:val="fr-FR"/>
-        </w:rPr>
-        <w:t xml:space="preserve">   * Mode Nuit Automatique</w:t>
-      </w:r>
-      <w:r>
-        <w:rPr>
-          <w:sz w:val="28"/>
-          <w:lang w:val="fr-FR"/>
-        </w:rPr>
-        <w:t xml:space="preserve"> : Adaptez les couleurs de l'application en fonction de l'heure pour réduire la lumière bleue en soirée.</w:t>
-      </w:r>
-    </w:p>
-    <w:p>
-      <w:pPr>
-        <w:jc w:val="both"/>
-        <w:rPr>
-          <w:sz w:val="28"/>
-          <w:lang w:val="fr-FR"/>
-        </w:rPr>
-      </w:pPr>
-      <w:r>
-        <w:rPr>
-          <w:b/>
-          <w:i/>
-          <w:sz w:val="28"/>
-          <w:lang w:val="fr-FR"/>
-        </w:rPr>
-        <w:t xml:space="preserve">   * Localisation</w:t>
-      </w:r>
-      <w:r>
-        <w:rPr>
-          <w:sz w:val="28"/>
-          <w:lang w:val="fr-FR"/>
-        </w:rPr>
-        <w:t xml:space="preserve"> : Proposez une version anglaise pour élargir votre audience potentielle.</w:t>
-      </w:r>
-    </w:p>
-    <w:p>
-      <w:pPr>
-        <w:jc w:val="both"/>
-        <w:rPr>
-          <w:sz w:val="28"/>
-          <w:lang w:val="fr-FR"/>
-        </w:rPr>
-      </w:pPr>
-      <w:r>
-        <w:rPr>
-          <w:sz w:val="28"/>
-          <w:lang w:val="fr-FR"/>
-        </w:rPr>
-        <w:t xml:space="preserve">  Suggestion prioritaire pour un impact immédiat :</w:t>
-      </w:r>
-    </w:p>
-    <w:p>
-      <w:pPr>
-        <w:jc w:val="both"/>
-        <w:rPr>
-          <w:sz w:val="28"/>
-          <w:lang w:val="fr-FR"/>
-        </w:rPr>
-      </w:pPr>
-      <w:r>
-        <w:rPr>
-          <w:sz w:val="28"/>
-          <w:lang w:val="fr-FR"/>
-        </w:rPr>
-        <w:t xml:space="preserve">L'ajout de </w:t>
-      </w:r>
-      <w:r>
-        <w:rPr>
-          <w:b/>
-          <w:sz w:val="28"/>
-          <w:lang w:val="fr-FR"/>
-        </w:rPr>
-        <w:t>Routines Guidées</w:t>
-      </w:r>
-      <w:r>
-        <w:rPr>
-          <w:sz w:val="28"/>
-          <w:lang w:val="fr-FR"/>
-        </w:rPr>
-        <w:t xml:space="preserve"> (</w:t>
-      </w:r>
-      <w:proofErr w:type="gramStart"/>
-      <w:r>
-        <w:rPr>
-          <w:sz w:val="28"/>
-          <w:lang w:val="fr-FR"/>
-        </w:rPr>
-        <w:t>ex:</w:t>
-      </w:r>
-      <w:proofErr w:type="gramEnd"/>
-      <w:r>
-        <w:rPr>
-          <w:sz w:val="28"/>
-          <w:lang w:val="fr-FR"/>
-        </w:rPr>
-        <w:t xml:space="preserve"> un bouton "Démarrer ma routine du matin") est probablement ce qui apporterait le plus de valeur d'usage, car cela enlève la charge mentale de choisir les exercices un par un.</w:t>
-      </w:r>
-    </w:p>
-    <w:p>
-      <w:pPr>
-        <w:rPr>
-          <w:sz w:val="28"/>
-          <w:lang w:val="fr-FR"/>
-        </w:rPr>
-      </w:pPr>
-      <w:r>
-        <w:rPr>
-          <w:sz w:val="28"/>
-          <w:lang w:val="fr-FR"/>
-        </w:rPr>
-        <w:br w:type="page"/>
-      </w:r>
-    </w:p>
-    <w:p>
-      <w:pPr>
-        <w:shd w:val="clear" w:color="auto" w:fill="002060"/>
-        <w:jc w:val="center"/>
-        <w:rPr>
-          <w:b/>
-          <w:sz w:val="28"/>
-          <w:lang w:val="fr-FR"/>
-        </w:rPr>
-      </w:pPr>
-      <w:r>
-        <w:rPr>
-          <w:b/>
-          <w:sz w:val="28"/>
-          <w:lang w:val="fr-FR"/>
-        </w:rPr>
-        <w:lastRenderedPageBreak/>
         <w:t>PLAN D’IMPLEMENTATION</w:t>
       </w:r>
     </w:p>
@@ -1905,7 +921,15 @@
           <w:sz w:val="28"/>
           <w:lang w:val="fr-FR"/>
         </w:rPr>
-        <w:t xml:space="preserve">       * Afficher une petite description au survol/clic (</w:t>
+        <w:t xml:space="preserve">       </w:t>
+      </w:r>
+      <w:bookmarkStart w:id="0" w:name="_GoBack"/>
+      <w:r>
+        <w:rPr>
+          <w:sz w:val="28"/>
+          <w:lang w:val="fr-FR"/>
+        </w:rPr>
+        <w:t>* Afficher une petite description au survol/clic (</w:t>
       </w:r>
       <w:proofErr w:type="gramStart"/>
       <w:r>
@@ -1937,25 +961,10 @@
           <w:sz w:val="28"/>
           <w:lang w:val="fr-FR"/>
         </w:rPr>
-        <w:t xml:space="preserve">   2. Conseils Posture/Éclairage :</w:t>
-      </w:r>
-    </w:p>
-    <w:p>
-      <w:pPr>
-        <w:jc w:val="both"/>
-        <w:rPr>
-          <w:sz w:val="28"/>
-          <w:lang w:val="fr-FR"/>
-        </w:rPr>
-      </w:pPr>
-      <w:r>
-        <w:rPr>
-          <w:sz w:val="28"/>
-          <w:lang w:val="fr-FR"/>
-        </w:rPr>
         <w:t xml:space="preserve">       * Ajouter un court texte de conseil aléatoire sur l'écran d'accueil (overlay) avant le démarrage.</w:t>
       </w:r>
     </w:p>
+    <w:bookmarkEnd w:id="0"/>
     <w:p>
       <w:pPr>
         <w:jc w:val="both"/>
@@ -2319,16 +1328,23 @@
           <w:sz w:val="28"/>
           <w:lang w:val="fr-FR"/>
         </w:rPr>
-        <w:t xml:space="preserve">       * Afficher des petits badges visuels quand l'utilisateur atteint des paliers (ex: "Hibou attentif" après 10</w:t>
-      </w:r>
-      <w:bookmarkStart w:id="0" w:name="_GoBack"/>
-      <w:bookmarkEnd w:id="0"/>
-      <w:r>
-        <w:rPr>
-          <w:sz w:val="28"/>
-          <w:lang w:val="fr-FR"/>
-        </w:rPr>
-        <w:t xml:space="preserve"> sessions).</w:t>
+        <w:t xml:space="preserve">       * Afficher des petits badges visuels quand l'utilisateur atteint des paliers (</w:t>
+      </w:r>
+      <w:proofErr w:type="gramStart"/>
+      <w:r>
+        <w:rPr>
+          <w:sz w:val="28"/>
+          <w:lang w:val="fr-FR"/>
+        </w:rPr>
+        <w:t>ex:</w:t>
+      </w:r>
+      <w:proofErr w:type="gramEnd"/>
+      <w:r>
+        <w:rPr>
+          <w:sz w:val="28"/>
+          <w:lang w:val="fr-FR"/>
+        </w:rPr>
+        <w:t xml:space="preserve"> "Hibou attentif" après 10 sessions).</w:t>
       </w:r>
     </w:p>
     <w:sectPr>

</xml_diff>